<commit_message>
Removed highlighted text, reset typeface.
</commit_message>
<xml_diff>
--- a/sample-text/GraphicallySimilarGlyphs.docx
+++ b/sample-text/GraphicallySimilarGlyphs.docx
@@ -131,7 +131,7 @@
         <w:spacing w:before="225" w:after="225"/>
         <w:ind w:firstLine="360"/>
         <w:rPr>
-          <w:rFonts w:ascii="Google Sans" w:eastAsia="Times New Roman" w:hAnsi="Google Sans" w:cs="Google Sans"/>
+          <w:rFonts w:ascii="Abyssinica SIL" w:eastAsia="Times New Roman" w:hAnsi="Abyssinica SIL" w:cs="Abyssinica SIL"/>
           <w:color w:val="000000"/>
           <w:kern w:val="0"/>
           <w:sz w:val="22"/>
@@ -143,7 +143,7 @@
       <w:proofErr w:type="spellStart"/>
       <w:r>
         <w:rPr>
-          <w:rFonts w:ascii="Google Sans" w:eastAsia="Times New Roman" w:hAnsi="Google Sans" w:cs="Google Sans"/>
+          <w:rFonts w:ascii="Abyssinica SIL" w:eastAsia="Times New Roman" w:hAnsi="Abyssinica SIL" w:cs="Abyssinica SIL"/>
           <w:color w:val="000000"/>
           <w:kern w:val="0"/>
           <w:sz w:val="22"/>
@@ -156,19 +156,19 @@
       <w:proofErr w:type="spellEnd"/>
       <w:r>
         <w:rPr>
-          <w:rFonts w:ascii="Google Sans" w:eastAsia="Times New Roman" w:hAnsi="Google Sans" w:cs="Google Sans"/>
-          <w:color w:val="000000"/>
-          <w:kern w:val="0"/>
-          <w:sz w:val="22"/>
-          <w:szCs w:val="22"/>
-          <w:lang w:eastAsia="ja-JP"/>
-          <w14:ligatures w14:val="none"/>
-        </w:rPr>
-        <w:t xml:space="preserve"> </w:t>
-      </w:r>
-      <w:r>
-        <w:rPr>
-          <w:rFonts w:ascii="Google Sans" w:eastAsia="Times New Roman" w:hAnsi="Google Sans" w:cs="Google Sans"/>
+          <w:rFonts w:ascii="Abyssinica SIL" w:eastAsia="Times New Roman" w:hAnsi="Abyssinica SIL" w:cs="Abyssinica SIL"/>
+          <w:color w:val="000000"/>
+          <w:kern w:val="0"/>
+          <w:sz w:val="22"/>
+          <w:szCs w:val="22"/>
+          <w:lang w:eastAsia="ja-JP"/>
+          <w14:ligatures w14:val="none"/>
+        </w:rPr>
+        <w:t xml:space="preserve"> </w:t>
+      </w:r>
+      <w:r>
+        <w:rPr>
+          <w:rFonts w:ascii="Abyssinica SIL" w:eastAsia="Times New Roman" w:hAnsi="Abyssinica SIL" w:cs="Abyssinica SIL"/>
           <w:color w:val="000000"/>
           <w:kern w:val="0"/>
           <w:sz w:val="22"/>
@@ -180,20 +180,20 @@
       </w:r>
       <w:r>
         <w:rPr>
-          <w:rFonts w:ascii="Google Sans" w:eastAsia="Times New Roman" w:hAnsi="Google Sans" w:cs="Google Sans"/>
-          <w:color w:val="000000"/>
-          <w:kern w:val="0"/>
-          <w:sz w:val="22"/>
-          <w:szCs w:val="22"/>
-          <w:lang w:eastAsia="ja-JP"/>
-          <w14:ligatures w14:val="none"/>
-        </w:rPr>
-        <w:t xml:space="preserve"> </w:t>
-      </w:r>
-      <w:proofErr w:type="spellStart"/>
-      <w:r>
-        <w:rPr>
-          <w:rFonts w:ascii="Google Sans" w:eastAsia="Times New Roman" w:hAnsi="Google Sans" w:cs="Google Sans"/>
+          <w:rFonts w:ascii="Abyssinica SIL" w:eastAsia="Times New Roman" w:hAnsi="Abyssinica SIL" w:cs="Abyssinica SIL"/>
+          <w:color w:val="000000"/>
+          <w:kern w:val="0"/>
+          <w:sz w:val="22"/>
+          <w:szCs w:val="22"/>
+          <w:lang w:eastAsia="ja-JP"/>
+          <w14:ligatures w14:val="none"/>
+        </w:rPr>
+        <w:t xml:space="preserve"> </w:t>
+      </w:r>
+      <w:proofErr w:type="spellStart"/>
+      <w:r>
+        <w:rPr>
+          <w:rFonts w:ascii="Abyssinica SIL" w:eastAsia="Times New Roman" w:hAnsi="Abyssinica SIL" w:cs="Abyssinica SIL"/>
           <w:color w:val="000000"/>
           <w:kern w:val="0"/>
           <w:sz w:val="22"/>
@@ -206,20 +206,20 @@
       <w:proofErr w:type="spellEnd"/>
       <w:r>
         <w:rPr>
-          <w:rFonts w:ascii="Google Sans" w:eastAsia="Times New Roman" w:hAnsi="Google Sans" w:cs="Google Sans"/>
-          <w:color w:val="000000"/>
-          <w:kern w:val="0"/>
-          <w:sz w:val="22"/>
-          <w:szCs w:val="22"/>
-          <w:lang w:eastAsia="ja-JP"/>
-          <w14:ligatures w14:val="none"/>
-        </w:rPr>
-        <w:t xml:space="preserve"> </w:t>
-      </w:r>
-      <w:proofErr w:type="spellStart"/>
-      <w:r>
-        <w:rPr>
-          <w:rFonts w:ascii="Google Sans" w:eastAsia="Times New Roman" w:hAnsi="Google Sans" w:cs="Google Sans"/>
+          <w:rFonts w:ascii="Abyssinica SIL" w:eastAsia="Times New Roman" w:hAnsi="Abyssinica SIL" w:cs="Abyssinica SIL"/>
+          <w:color w:val="000000"/>
+          <w:kern w:val="0"/>
+          <w:sz w:val="22"/>
+          <w:szCs w:val="22"/>
+          <w:lang w:eastAsia="ja-JP"/>
+          <w14:ligatures w14:val="none"/>
+        </w:rPr>
+        <w:t xml:space="preserve"> </w:t>
+      </w:r>
+      <w:proofErr w:type="spellStart"/>
+      <w:r>
+        <w:rPr>
+          <w:rFonts w:ascii="Abyssinica SIL" w:eastAsia="Times New Roman" w:hAnsi="Abyssinica SIL" w:cs="Abyssinica SIL"/>
           <w:color w:val="000000"/>
           <w:kern w:val="0"/>
           <w:sz w:val="22"/>
@@ -232,20 +232,20 @@
       <w:proofErr w:type="spellEnd"/>
       <w:r>
         <w:rPr>
-          <w:rFonts w:ascii="Google Sans" w:eastAsia="Times New Roman" w:hAnsi="Google Sans" w:cs="Google Sans"/>
-          <w:color w:val="000000"/>
-          <w:kern w:val="0"/>
-          <w:sz w:val="22"/>
-          <w:szCs w:val="22"/>
-          <w:lang w:eastAsia="ja-JP"/>
-          <w14:ligatures w14:val="none"/>
-        </w:rPr>
-        <w:t xml:space="preserve"> </w:t>
-      </w:r>
-      <w:proofErr w:type="spellStart"/>
-      <w:r>
-        <w:rPr>
-          <w:rFonts w:ascii="Google Sans" w:eastAsia="Times New Roman" w:hAnsi="Google Sans" w:cs="Google Sans"/>
+          <w:rFonts w:ascii="Abyssinica SIL" w:eastAsia="Times New Roman" w:hAnsi="Abyssinica SIL" w:cs="Abyssinica SIL"/>
+          <w:color w:val="000000"/>
+          <w:kern w:val="0"/>
+          <w:sz w:val="22"/>
+          <w:szCs w:val="22"/>
+          <w:lang w:eastAsia="ja-JP"/>
+          <w14:ligatures w14:val="none"/>
+        </w:rPr>
+        <w:t xml:space="preserve"> </w:t>
+      </w:r>
+      <w:proofErr w:type="spellStart"/>
+      <w:r>
+        <w:rPr>
+          <w:rFonts w:ascii="Abyssinica SIL" w:eastAsia="Times New Roman" w:hAnsi="Abyssinica SIL" w:cs="Abyssinica SIL"/>
           <w:color w:val="000000"/>
           <w:kern w:val="0"/>
           <w:sz w:val="22"/>
@@ -258,20 +258,20 @@
       <w:proofErr w:type="spellEnd"/>
       <w:r>
         <w:rPr>
-          <w:rFonts w:ascii="Google Sans" w:eastAsia="Times New Roman" w:hAnsi="Google Sans" w:cs="Google Sans"/>
-          <w:color w:val="000000"/>
-          <w:kern w:val="0"/>
-          <w:sz w:val="22"/>
-          <w:szCs w:val="22"/>
-          <w:lang w:eastAsia="ja-JP"/>
-          <w14:ligatures w14:val="none"/>
-        </w:rPr>
-        <w:t xml:space="preserve"> </w:t>
-      </w:r>
-      <w:proofErr w:type="spellStart"/>
-      <w:r>
-        <w:rPr>
-          <w:rFonts w:ascii="Google Sans" w:eastAsia="Times New Roman" w:hAnsi="Google Sans" w:cs="Google Sans"/>
+          <w:rFonts w:ascii="Abyssinica SIL" w:eastAsia="Times New Roman" w:hAnsi="Abyssinica SIL" w:cs="Abyssinica SIL"/>
+          <w:color w:val="000000"/>
+          <w:kern w:val="0"/>
+          <w:sz w:val="22"/>
+          <w:szCs w:val="22"/>
+          <w:lang w:eastAsia="ja-JP"/>
+          <w14:ligatures w14:val="none"/>
+        </w:rPr>
+        <w:t xml:space="preserve"> </w:t>
+      </w:r>
+      <w:proofErr w:type="spellStart"/>
+      <w:r>
+        <w:rPr>
+          <w:rFonts w:ascii="Abyssinica SIL" w:eastAsia="Times New Roman" w:hAnsi="Abyssinica SIL" w:cs="Abyssinica SIL"/>
           <w:color w:val="000000"/>
           <w:kern w:val="0"/>
           <w:sz w:val="22"/>
@@ -284,20 +284,20 @@
       <w:proofErr w:type="spellEnd"/>
       <w:r>
         <w:rPr>
-          <w:rFonts w:ascii="Google Sans" w:eastAsia="Times New Roman" w:hAnsi="Google Sans" w:cs="Google Sans"/>
-          <w:color w:val="000000"/>
-          <w:kern w:val="0"/>
-          <w:sz w:val="22"/>
-          <w:szCs w:val="22"/>
-          <w:lang w:eastAsia="ja-JP"/>
-          <w14:ligatures w14:val="none"/>
-        </w:rPr>
-        <w:t xml:space="preserve"> </w:t>
-      </w:r>
-      <w:proofErr w:type="spellStart"/>
-      <w:r>
-        <w:rPr>
-          <w:rFonts w:ascii="Google Sans" w:eastAsia="Times New Roman" w:hAnsi="Google Sans" w:cs="Google Sans"/>
+          <w:rFonts w:ascii="Abyssinica SIL" w:eastAsia="Times New Roman" w:hAnsi="Abyssinica SIL" w:cs="Abyssinica SIL"/>
+          <w:color w:val="000000"/>
+          <w:kern w:val="0"/>
+          <w:sz w:val="22"/>
+          <w:szCs w:val="22"/>
+          <w:lang w:eastAsia="ja-JP"/>
+          <w14:ligatures w14:val="none"/>
+        </w:rPr>
+        <w:t xml:space="preserve"> </w:t>
+      </w:r>
+      <w:proofErr w:type="spellStart"/>
+      <w:r>
+        <w:rPr>
+          <w:rFonts w:ascii="Abyssinica SIL" w:eastAsia="Times New Roman" w:hAnsi="Abyssinica SIL" w:cs="Abyssinica SIL"/>
           <w:color w:val="000000"/>
           <w:kern w:val="0"/>
           <w:sz w:val="22"/>
@@ -310,20 +310,20 @@
       <w:proofErr w:type="spellEnd"/>
       <w:r>
         <w:rPr>
-          <w:rFonts w:ascii="Google Sans" w:eastAsia="Times New Roman" w:hAnsi="Google Sans" w:cs="Google Sans"/>
-          <w:color w:val="000000"/>
-          <w:kern w:val="0"/>
-          <w:sz w:val="22"/>
-          <w:szCs w:val="22"/>
-          <w:lang w:eastAsia="ja-JP"/>
-          <w14:ligatures w14:val="none"/>
-        </w:rPr>
-        <w:t xml:space="preserve"> </w:t>
-      </w:r>
-      <w:proofErr w:type="spellStart"/>
-      <w:r>
-        <w:rPr>
-          <w:rFonts w:ascii="Google Sans" w:eastAsia="Times New Roman" w:hAnsi="Google Sans" w:cs="Google Sans"/>
+          <w:rFonts w:ascii="Abyssinica SIL" w:eastAsia="Times New Roman" w:hAnsi="Abyssinica SIL" w:cs="Abyssinica SIL"/>
+          <w:color w:val="000000"/>
+          <w:kern w:val="0"/>
+          <w:sz w:val="22"/>
+          <w:szCs w:val="22"/>
+          <w:lang w:eastAsia="ja-JP"/>
+          <w14:ligatures w14:val="none"/>
+        </w:rPr>
+        <w:t xml:space="preserve"> </w:t>
+      </w:r>
+      <w:proofErr w:type="spellStart"/>
+      <w:r>
+        <w:rPr>
+          <w:rFonts w:ascii="Abyssinica SIL" w:eastAsia="Times New Roman" w:hAnsi="Abyssinica SIL" w:cs="Abyssinica SIL"/>
           <w:color w:val="000000"/>
           <w:kern w:val="0"/>
           <w:sz w:val="22"/>
@@ -336,20 +336,20 @@
       <w:proofErr w:type="spellEnd"/>
       <w:r>
         <w:rPr>
-          <w:rFonts w:ascii="Google Sans" w:eastAsia="Times New Roman" w:hAnsi="Google Sans" w:cs="Google Sans"/>
-          <w:color w:val="000000"/>
-          <w:kern w:val="0"/>
-          <w:sz w:val="22"/>
-          <w:szCs w:val="22"/>
-          <w:lang w:eastAsia="ja-JP"/>
-          <w14:ligatures w14:val="none"/>
-        </w:rPr>
-        <w:t xml:space="preserve"> </w:t>
-      </w:r>
-      <w:proofErr w:type="spellStart"/>
-      <w:r>
-        <w:rPr>
-          <w:rFonts w:ascii="Google Sans" w:eastAsia="Times New Roman" w:hAnsi="Google Sans" w:cs="Google Sans"/>
+          <w:rFonts w:ascii="Abyssinica SIL" w:eastAsia="Times New Roman" w:hAnsi="Abyssinica SIL" w:cs="Abyssinica SIL"/>
+          <w:color w:val="000000"/>
+          <w:kern w:val="0"/>
+          <w:sz w:val="22"/>
+          <w:szCs w:val="22"/>
+          <w:lang w:eastAsia="ja-JP"/>
+          <w14:ligatures w14:val="none"/>
+        </w:rPr>
+        <w:t xml:space="preserve"> </w:t>
+      </w:r>
+      <w:proofErr w:type="spellStart"/>
+      <w:r>
+        <w:rPr>
+          <w:rFonts w:ascii="Abyssinica SIL" w:eastAsia="Times New Roman" w:hAnsi="Abyssinica SIL" w:cs="Abyssinica SIL"/>
           <w:color w:val="000000"/>
           <w:kern w:val="0"/>
           <w:sz w:val="22"/>
@@ -362,20 +362,20 @@
       <w:proofErr w:type="spellEnd"/>
       <w:r>
         <w:rPr>
-          <w:rFonts w:ascii="Google Sans" w:eastAsia="Times New Roman" w:hAnsi="Google Sans" w:cs="Google Sans"/>
-          <w:color w:val="000000"/>
-          <w:kern w:val="0"/>
-          <w:sz w:val="22"/>
-          <w:szCs w:val="22"/>
-          <w:lang w:eastAsia="ja-JP"/>
-          <w14:ligatures w14:val="none"/>
-        </w:rPr>
-        <w:t xml:space="preserve"> </w:t>
-      </w:r>
-      <w:proofErr w:type="spellStart"/>
-      <w:r>
-        <w:rPr>
-          <w:rFonts w:ascii="Google Sans" w:eastAsia="Times New Roman" w:hAnsi="Google Sans" w:cs="Google Sans"/>
+          <w:rFonts w:ascii="Abyssinica SIL" w:eastAsia="Times New Roman" w:hAnsi="Abyssinica SIL" w:cs="Abyssinica SIL"/>
+          <w:color w:val="000000"/>
+          <w:kern w:val="0"/>
+          <w:sz w:val="22"/>
+          <w:szCs w:val="22"/>
+          <w:lang w:eastAsia="ja-JP"/>
+          <w14:ligatures w14:val="none"/>
+        </w:rPr>
+        <w:t xml:space="preserve"> </w:t>
+      </w:r>
+      <w:proofErr w:type="spellStart"/>
+      <w:r>
+        <w:rPr>
+          <w:rFonts w:ascii="Abyssinica SIL" w:eastAsia="Times New Roman" w:hAnsi="Abyssinica SIL" w:cs="Abyssinica SIL"/>
           <w:color w:val="000000"/>
           <w:kern w:val="0"/>
           <w:sz w:val="22"/>
@@ -388,20 +388,20 @@
       <w:proofErr w:type="spellEnd"/>
       <w:r>
         <w:rPr>
-          <w:rFonts w:ascii="Google Sans" w:eastAsia="Times New Roman" w:hAnsi="Google Sans" w:cs="Google Sans"/>
-          <w:color w:val="000000"/>
-          <w:kern w:val="0"/>
-          <w:sz w:val="22"/>
-          <w:szCs w:val="22"/>
-          <w:lang w:eastAsia="ja-JP"/>
-          <w14:ligatures w14:val="none"/>
-        </w:rPr>
-        <w:t xml:space="preserve"> </w:t>
-      </w:r>
-      <w:proofErr w:type="spellStart"/>
-      <w:r>
-        <w:rPr>
-          <w:rFonts w:ascii="Google Sans" w:eastAsia="Times New Roman" w:hAnsi="Google Sans" w:cs="Google Sans"/>
+          <w:rFonts w:ascii="Abyssinica SIL" w:eastAsia="Times New Roman" w:hAnsi="Abyssinica SIL" w:cs="Abyssinica SIL"/>
+          <w:color w:val="000000"/>
+          <w:kern w:val="0"/>
+          <w:sz w:val="22"/>
+          <w:szCs w:val="22"/>
+          <w:lang w:eastAsia="ja-JP"/>
+          <w14:ligatures w14:val="none"/>
+        </w:rPr>
+        <w:t xml:space="preserve"> </w:t>
+      </w:r>
+      <w:proofErr w:type="spellStart"/>
+      <w:r>
+        <w:rPr>
+          <w:rFonts w:ascii="Abyssinica SIL" w:eastAsia="Times New Roman" w:hAnsi="Abyssinica SIL" w:cs="Abyssinica SIL"/>
           <w:color w:val="000000"/>
           <w:kern w:val="0"/>
           <w:sz w:val="22"/>
@@ -414,20 +414,20 @@
       <w:proofErr w:type="spellEnd"/>
       <w:r>
         <w:rPr>
-          <w:rFonts w:ascii="Google Sans" w:eastAsia="Times New Roman" w:hAnsi="Google Sans" w:cs="Google Sans"/>
-          <w:color w:val="000000"/>
-          <w:kern w:val="0"/>
-          <w:sz w:val="22"/>
-          <w:szCs w:val="22"/>
-          <w:lang w:eastAsia="ja-JP"/>
-          <w14:ligatures w14:val="none"/>
-        </w:rPr>
-        <w:t xml:space="preserve"> </w:t>
-      </w:r>
-      <w:proofErr w:type="spellStart"/>
-      <w:r>
-        <w:rPr>
-          <w:rFonts w:ascii="Google Sans" w:eastAsia="Times New Roman" w:hAnsi="Google Sans" w:cs="Google Sans"/>
+          <w:rFonts w:ascii="Abyssinica SIL" w:eastAsia="Times New Roman" w:hAnsi="Abyssinica SIL" w:cs="Abyssinica SIL"/>
+          <w:color w:val="000000"/>
+          <w:kern w:val="0"/>
+          <w:sz w:val="22"/>
+          <w:szCs w:val="22"/>
+          <w:lang w:eastAsia="ja-JP"/>
+          <w14:ligatures w14:val="none"/>
+        </w:rPr>
+        <w:t xml:space="preserve"> </w:t>
+      </w:r>
+      <w:proofErr w:type="spellStart"/>
+      <w:r>
+        <w:rPr>
+          <w:rFonts w:ascii="Abyssinica SIL" w:eastAsia="Times New Roman" w:hAnsi="Abyssinica SIL" w:cs="Abyssinica SIL"/>
           <w:color w:val="000000"/>
           <w:kern w:val="0"/>
           <w:sz w:val="22"/>
@@ -440,25 +440,24 @@
       <w:proofErr w:type="spellEnd"/>
       <w:r>
         <w:rPr>
-          <w:rFonts w:ascii="Google Sans" w:eastAsia="Times New Roman" w:hAnsi="Google Sans" w:cs="Google Sans"/>
-          <w:color w:val="000000"/>
-          <w:kern w:val="0"/>
-          <w:sz w:val="22"/>
-          <w:szCs w:val="22"/>
-          <w:lang w:eastAsia="ja-JP"/>
-          <w14:ligatures w14:val="none"/>
-        </w:rPr>
-        <w:t xml:space="preserve"> </w:t>
-      </w:r>
-      <w:proofErr w:type="spellStart"/>
-      <w:r>
-        <w:rPr>
-          <w:rFonts w:ascii="Google Sans" w:eastAsia="Times New Roman" w:hAnsi="Google Sans" w:cs="Google Sans"/>
-          <w:color w:val="000000"/>
-          <w:kern w:val="0"/>
-          <w:sz w:val="22"/>
-          <w:szCs w:val="22"/>
-          <w:highlight w:val="yellow"/>
+          <w:rFonts w:ascii="Abyssinica SIL" w:eastAsia="Times New Roman" w:hAnsi="Abyssinica SIL" w:cs="Abyssinica SIL"/>
+          <w:color w:val="000000"/>
+          <w:kern w:val="0"/>
+          <w:sz w:val="22"/>
+          <w:szCs w:val="22"/>
+          <w:lang w:eastAsia="ja-JP"/>
+          <w14:ligatures w14:val="none"/>
+        </w:rPr>
+        <w:t xml:space="preserve"> </w:t>
+      </w:r>
+      <w:proofErr w:type="spellStart"/>
+      <w:r>
+        <w:rPr>
+          <w:rFonts w:ascii="Abyssinica SIL" w:eastAsia="Times New Roman" w:hAnsi="Abyssinica SIL" w:cs="Abyssinica SIL"/>
+          <w:color w:val="000000"/>
+          <w:kern w:val="0"/>
+          <w:sz w:val="22"/>
+          <w:szCs w:val="22"/>
           <w:lang w:eastAsia="ja-JP"/>
           <w14:ligatures w14:val="none"/>
         </w:rPr>
@@ -467,20 +466,20 @@
       <w:proofErr w:type="spellEnd"/>
       <w:r>
         <w:rPr>
-          <w:rFonts w:ascii="Google Sans" w:eastAsia="Times New Roman" w:hAnsi="Google Sans" w:cs="Google Sans"/>
-          <w:color w:val="000000"/>
-          <w:kern w:val="0"/>
-          <w:sz w:val="22"/>
-          <w:szCs w:val="22"/>
-          <w:lang w:eastAsia="ja-JP"/>
-          <w14:ligatures w14:val="none"/>
-        </w:rPr>
-        <w:t xml:space="preserve"> </w:t>
-      </w:r>
-      <w:proofErr w:type="spellStart"/>
-      <w:r>
-        <w:rPr>
-          <w:rFonts w:ascii="Google Sans" w:eastAsia="Times New Roman" w:hAnsi="Google Sans" w:cs="Google Sans"/>
+          <w:rFonts w:ascii="Abyssinica SIL" w:eastAsia="Times New Roman" w:hAnsi="Abyssinica SIL" w:cs="Abyssinica SIL"/>
+          <w:color w:val="000000"/>
+          <w:kern w:val="0"/>
+          <w:sz w:val="22"/>
+          <w:szCs w:val="22"/>
+          <w:lang w:eastAsia="ja-JP"/>
+          <w14:ligatures w14:val="none"/>
+        </w:rPr>
+        <w:t xml:space="preserve"> </w:t>
+      </w:r>
+      <w:proofErr w:type="spellStart"/>
+      <w:r>
+        <w:rPr>
+          <w:rFonts w:ascii="Abyssinica SIL" w:eastAsia="Times New Roman" w:hAnsi="Abyssinica SIL" w:cs="Abyssinica SIL"/>
           <w:color w:val="000000"/>
           <w:kern w:val="0"/>
           <w:sz w:val="22"/>
@@ -493,20 +492,20 @@
       <w:proofErr w:type="spellEnd"/>
       <w:r>
         <w:rPr>
-          <w:rFonts w:ascii="Google Sans" w:eastAsia="Times New Roman" w:hAnsi="Google Sans" w:cs="Google Sans"/>
-          <w:color w:val="000000"/>
-          <w:kern w:val="0"/>
-          <w:sz w:val="22"/>
-          <w:szCs w:val="22"/>
-          <w:lang w:eastAsia="ja-JP"/>
-          <w14:ligatures w14:val="none"/>
-        </w:rPr>
-        <w:t xml:space="preserve"> </w:t>
-      </w:r>
-      <w:proofErr w:type="spellStart"/>
-      <w:r>
-        <w:rPr>
-          <w:rFonts w:ascii="Google Sans" w:eastAsia="Times New Roman" w:hAnsi="Google Sans" w:cs="Google Sans"/>
+          <w:rFonts w:ascii="Abyssinica SIL" w:eastAsia="Times New Roman" w:hAnsi="Abyssinica SIL" w:cs="Abyssinica SIL"/>
+          <w:color w:val="000000"/>
+          <w:kern w:val="0"/>
+          <w:sz w:val="22"/>
+          <w:szCs w:val="22"/>
+          <w:lang w:eastAsia="ja-JP"/>
+          <w14:ligatures w14:val="none"/>
+        </w:rPr>
+        <w:t xml:space="preserve"> </w:t>
+      </w:r>
+      <w:proofErr w:type="spellStart"/>
+      <w:r>
+        <w:rPr>
+          <w:rFonts w:ascii="Abyssinica SIL" w:eastAsia="Times New Roman" w:hAnsi="Abyssinica SIL" w:cs="Abyssinica SIL"/>
           <w:color w:val="000000"/>
           <w:kern w:val="0"/>
           <w:sz w:val="22"/>
@@ -546,7 +545,7 @@
         <w:spacing w:before="225" w:after="225"/>
         <w:ind w:firstLine="360"/>
         <w:rPr>
-          <w:rFonts w:ascii="Google Sans" w:eastAsia="Times New Roman" w:hAnsi="Google Sans" w:cs="Google Sans"/>
+          <w:rFonts w:ascii="Abyssinica SIL" w:eastAsia="Times New Roman" w:hAnsi="Abyssinica SIL" w:cs="Abyssinica SIL"/>
           <w:color w:val="000000"/>
           <w:kern w:val="0"/>
           <w:sz w:val="22"/>
@@ -558,7 +557,7 @@
       <w:proofErr w:type="spellStart"/>
       <w:r>
         <w:rPr>
-          <w:rFonts w:ascii="Google Sans" w:eastAsia="Times New Roman" w:hAnsi="Google Sans" w:cs="Google Sans"/>
+          <w:rFonts w:ascii="Abyssinica SIL" w:eastAsia="Times New Roman" w:hAnsi="Abyssinica SIL" w:cs="Abyssinica SIL"/>
           <w:color w:val="000000"/>
           <w:kern w:val="0"/>
           <w:sz w:val="22"/>
@@ -571,20 +570,20 @@
       <w:proofErr w:type="spellEnd"/>
       <w:r>
         <w:rPr>
-          <w:rFonts w:ascii="Google Sans" w:eastAsia="Times New Roman" w:hAnsi="Google Sans" w:cs="Google Sans"/>
-          <w:color w:val="000000"/>
-          <w:kern w:val="0"/>
-          <w:sz w:val="22"/>
-          <w:szCs w:val="22"/>
-          <w:lang w:eastAsia="ja-JP"/>
-          <w14:ligatures w14:val="none"/>
-        </w:rPr>
-        <w:t xml:space="preserve"> </w:t>
-      </w:r>
-      <w:proofErr w:type="spellStart"/>
-      <w:r>
-        <w:rPr>
-          <w:rFonts w:ascii="Google Sans" w:eastAsia="Times New Roman" w:hAnsi="Google Sans" w:cs="Google Sans"/>
+          <w:rFonts w:ascii="Abyssinica SIL" w:eastAsia="Times New Roman" w:hAnsi="Abyssinica SIL" w:cs="Abyssinica SIL"/>
+          <w:color w:val="000000"/>
+          <w:kern w:val="0"/>
+          <w:sz w:val="22"/>
+          <w:szCs w:val="22"/>
+          <w:lang w:eastAsia="ja-JP"/>
+          <w14:ligatures w14:val="none"/>
+        </w:rPr>
+        <w:t xml:space="preserve"> </w:t>
+      </w:r>
+      <w:proofErr w:type="spellStart"/>
+      <w:r>
+        <w:rPr>
+          <w:rFonts w:ascii="Abyssinica SIL" w:eastAsia="Times New Roman" w:hAnsi="Abyssinica SIL" w:cs="Abyssinica SIL"/>
           <w:color w:val="000000"/>
           <w:kern w:val="0"/>
           <w:sz w:val="22"/>
@@ -597,20 +596,20 @@
       <w:proofErr w:type="spellEnd"/>
       <w:r>
         <w:rPr>
-          <w:rFonts w:ascii="Google Sans" w:eastAsia="Times New Roman" w:hAnsi="Google Sans" w:cs="Google Sans"/>
-          <w:color w:val="000000"/>
-          <w:kern w:val="0"/>
-          <w:sz w:val="22"/>
-          <w:szCs w:val="22"/>
-          <w:lang w:eastAsia="ja-JP"/>
-          <w14:ligatures w14:val="none"/>
-        </w:rPr>
-        <w:t xml:space="preserve"> </w:t>
-      </w:r>
-      <w:proofErr w:type="spellStart"/>
-      <w:r>
-        <w:rPr>
-          <w:rFonts w:ascii="Google Sans" w:eastAsia="Times New Roman" w:hAnsi="Google Sans" w:cs="Google Sans"/>
+          <w:rFonts w:ascii="Abyssinica SIL" w:eastAsia="Times New Roman" w:hAnsi="Abyssinica SIL" w:cs="Abyssinica SIL"/>
+          <w:color w:val="000000"/>
+          <w:kern w:val="0"/>
+          <w:sz w:val="22"/>
+          <w:szCs w:val="22"/>
+          <w:lang w:eastAsia="ja-JP"/>
+          <w14:ligatures w14:val="none"/>
+        </w:rPr>
+        <w:t xml:space="preserve"> </w:t>
+      </w:r>
+      <w:proofErr w:type="spellStart"/>
+      <w:r>
+        <w:rPr>
+          <w:rFonts w:ascii="Abyssinica SIL" w:eastAsia="Times New Roman" w:hAnsi="Abyssinica SIL" w:cs="Abyssinica SIL"/>
           <w:color w:val="000000"/>
           <w:kern w:val="0"/>
           <w:sz w:val="22"/>
@@ -623,20 +622,20 @@
       <w:proofErr w:type="spellEnd"/>
       <w:r>
         <w:rPr>
-          <w:rFonts w:ascii="Google Sans" w:eastAsia="Times New Roman" w:hAnsi="Google Sans" w:cs="Google Sans"/>
-          <w:color w:val="000000"/>
-          <w:kern w:val="0"/>
-          <w:sz w:val="22"/>
-          <w:szCs w:val="22"/>
-          <w:lang w:eastAsia="ja-JP"/>
-          <w14:ligatures w14:val="none"/>
-        </w:rPr>
-        <w:t xml:space="preserve"> </w:t>
-      </w:r>
-      <w:proofErr w:type="spellStart"/>
-      <w:r>
-        <w:rPr>
-          <w:rFonts w:ascii="Google Sans" w:eastAsia="Times New Roman" w:hAnsi="Google Sans" w:cs="Google Sans"/>
+          <w:rFonts w:ascii="Abyssinica SIL" w:eastAsia="Times New Roman" w:hAnsi="Abyssinica SIL" w:cs="Abyssinica SIL"/>
+          <w:color w:val="000000"/>
+          <w:kern w:val="0"/>
+          <w:sz w:val="22"/>
+          <w:szCs w:val="22"/>
+          <w:lang w:eastAsia="ja-JP"/>
+          <w14:ligatures w14:val="none"/>
+        </w:rPr>
+        <w:t xml:space="preserve"> </w:t>
+      </w:r>
+      <w:proofErr w:type="spellStart"/>
+      <w:r>
+        <w:rPr>
+          <w:rFonts w:ascii="Abyssinica SIL" w:eastAsia="Times New Roman" w:hAnsi="Abyssinica SIL" w:cs="Abyssinica SIL"/>
           <w:color w:val="000000"/>
           <w:kern w:val="0"/>
           <w:sz w:val="22"/>
@@ -649,7 +648,7 @@
       <w:proofErr w:type="spellEnd"/>
       <w:r>
         <w:rPr>
-          <w:rFonts w:ascii="Google Sans" w:eastAsia="Times New Roman" w:hAnsi="Google Sans" w:cs="Google Sans"/>
+          <w:rFonts w:ascii="Abyssinica SIL" w:eastAsia="Times New Roman" w:hAnsi="Abyssinica SIL" w:cs="Abyssinica SIL"/>
           <w:color w:val="000000"/>
           <w:kern w:val="0"/>
           <w:sz w:val="22"/>
@@ -719,7 +718,7 @@
         <w:shd w:val="clear" w:color="auto" w:fill="FFFFFF"/>
         <w:spacing w:before="225"/>
         <w:rPr>
-          <w:rFonts w:ascii="Google Sans" w:eastAsia="Times New Roman" w:hAnsi="Google Sans" w:cs="Google Sans"/>
+          <w:rFonts w:ascii="Abyssinica SIL" w:eastAsia="Times New Roman" w:hAnsi="Abyssinica SIL" w:cs="Abyssinica SIL"/>
           <w:color w:val="000000"/>
           <w:kern w:val="0"/>
           <w:sz w:val="22"/>
@@ -731,7 +730,7 @@
       <w:proofErr w:type="spellStart"/>
       <w:r>
         <w:rPr>
-          <w:rFonts w:ascii="Google Sans" w:eastAsia="Times New Roman" w:hAnsi="Google Sans" w:cs="Google Sans"/>
+          <w:rFonts w:ascii="Abyssinica SIL" w:eastAsia="Times New Roman" w:hAnsi="Abyssinica SIL" w:cs="Abyssinica SIL"/>
           <w:color w:val="000000"/>
           <w:kern w:val="0"/>
           <w:sz w:val="22"/>
@@ -744,19 +743,19 @@
       <w:proofErr w:type="spellEnd"/>
       <w:r>
         <w:rPr>
-          <w:rFonts w:ascii="Google Sans" w:eastAsia="Times New Roman" w:hAnsi="Google Sans" w:cs="Google Sans"/>
-          <w:color w:val="000000"/>
-          <w:kern w:val="0"/>
-          <w:sz w:val="22"/>
-          <w:szCs w:val="22"/>
-          <w:lang w:eastAsia="ja-JP"/>
-          <w14:ligatures w14:val="none"/>
-        </w:rPr>
-        <w:t xml:space="preserve"> </w:t>
-      </w:r>
-      <w:r>
-        <w:rPr>
-          <w:rFonts w:ascii="Google Sans" w:eastAsia="Times New Roman" w:hAnsi="Google Sans" w:cs="Google Sans"/>
+          <w:rFonts w:ascii="Abyssinica SIL" w:eastAsia="Times New Roman" w:hAnsi="Abyssinica SIL" w:cs="Abyssinica SIL"/>
+          <w:color w:val="000000"/>
+          <w:kern w:val="0"/>
+          <w:sz w:val="22"/>
+          <w:szCs w:val="22"/>
+          <w:lang w:eastAsia="ja-JP"/>
+          <w14:ligatures w14:val="none"/>
+        </w:rPr>
+        <w:t xml:space="preserve"> </w:t>
+      </w:r>
+      <w:r>
+        <w:rPr>
+          <w:rFonts w:ascii="Abyssinica SIL" w:eastAsia="Times New Roman" w:hAnsi="Abyssinica SIL" w:cs="Abyssinica SIL"/>
           <w:color w:val="000000"/>
           <w:kern w:val="0"/>
           <w:sz w:val="22"/>
@@ -769,7 +768,7 @@
       <w:proofErr w:type="spellStart"/>
       <w:r>
         <w:rPr>
-          <w:rFonts w:ascii="Google Sans" w:eastAsia="Times New Roman" w:hAnsi="Google Sans" w:cs="Google Sans"/>
+          <w:rFonts w:ascii="Abyssinica SIL" w:eastAsia="Times New Roman" w:hAnsi="Abyssinica SIL" w:cs="Abyssinica SIL"/>
           <w:color w:val="000000"/>
           <w:kern w:val="0"/>
           <w:sz w:val="22"/>
@@ -782,20 +781,20 @@
       <w:proofErr w:type="spellEnd"/>
       <w:r>
         <w:rPr>
-          <w:rFonts w:ascii="Google Sans" w:eastAsia="Times New Roman" w:hAnsi="Google Sans" w:cs="Google Sans"/>
-          <w:color w:val="000000"/>
-          <w:kern w:val="0"/>
-          <w:sz w:val="22"/>
-          <w:szCs w:val="22"/>
-          <w:lang w:eastAsia="ja-JP"/>
-          <w14:ligatures w14:val="none"/>
-        </w:rPr>
-        <w:t xml:space="preserve"> </w:t>
-      </w:r>
-      <w:proofErr w:type="spellStart"/>
-      <w:r>
-        <w:rPr>
-          <w:rFonts w:ascii="Google Sans" w:eastAsia="Times New Roman" w:hAnsi="Google Sans" w:cs="Google Sans"/>
+          <w:rFonts w:ascii="Abyssinica SIL" w:eastAsia="Times New Roman" w:hAnsi="Abyssinica SIL" w:cs="Abyssinica SIL"/>
+          <w:color w:val="000000"/>
+          <w:kern w:val="0"/>
+          <w:sz w:val="22"/>
+          <w:szCs w:val="22"/>
+          <w:lang w:eastAsia="ja-JP"/>
+          <w14:ligatures w14:val="none"/>
+        </w:rPr>
+        <w:t xml:space="preserve"> </w:t>
+      </w:r>
+      <w:proofErr w:type="spellStart"/>
+      <w:r>
+        <w:rPr>
+          <w:rFonts w:ascii="Abyssinica SIL" w:eastAsia="Times New Roman" w:hAnsi="Abyssinica SIL" w:cs="Abyssinica SIL"/>
           <w:color w:val="000000"/>
           <w:kern w:val="0"/>
           <w:sz w:val="22"/>
@@ -808,20 +807,20 @@
       <w:proofErr w:type="spellEnd"/>
       <w:r>
         <w:rPr>
-          <w:rFonts w:ascii="Google Sans" w:eastAsia="Times New Roman" w:hAnsi="Google Sans" w:cs="Google Sans"/>
-          <w:color w:val="000000"/>
-          <w:kern w:val="0"/>
-          <w:sz w:val="22"/>
-          <w:szCs w:val="22"/>
-          <w:lang w:eastAsia="ja-JP"/>
-          <w14:ligatures w14:val="none"/>
-        </w:rPr>
-        <w:t xml:space="preserve"> </w:t>
-      </w:r>
-      <w:proofErr w:type="spellStart"/>
-      <w:r>
-        <w:rPr>
-          <w:rFonts w:ascii="Google Sans" w:eastAsia="Times New Roman" w:hAnsi="Google Sans" w:cs="Google Sans"/>
+          <w:rFonts w:ascii="Abyssinica SIL" w:eastAsia="Times New Roman" w:hAnsi="Abyssinica SIL" w:cs="Abyssinica SIL"/>
+          <w:color w:val="000000"/>
+          <w:kern w:val="0"/>
+          <w:sz w:val="22"/>
+          <w:szCs w:val="22"/>
+          <w:lang w:eastAsia="ja-JP"/>
+          <w14:ligatures w14:val="none"/>
+        </w:rPr>
+        <w:t xml:space="preserve"> </w:t>
+      </w:r>
+      <w:proofErr w:type="spellStart"/>
+      <w:r>
+        <w:rPr>
+          <w:rFonts w:ascii="Abyssinica SIL" w:eastAsia="Times New Roman" w:hAnsi="Abyssinica SIL" w:cs="Abyssinica SIL"/>
           <w:color w:val="000000"/>
           <w:kern w:val="0"/>
           <w:sz w:val="22"/>
@@ -834,20 +833,20 @@
       <w:proofErr w:type="spellEnd"/>
       <w:r>
         <w:rPr>
-          <w:rFonts w:ascii="Google Sans" w:eastAsia="Times New Roman" w:hAnsi="Google Sans" w:cs="Google Sans"/>
-          <w:color w:val="000000"/>
-          <w:kern w:val="0"/>
-          <w:sz w:val="22"/>
-          <w:szCs w:val="22"/>
-          <w:lang w:eastAsia="ja-JP"/>
-          <w14:ligatures w14:val="none"/>
-        </w:rPr>
-        <w:t xml:space="preserve"> </w:t>
-      </w:r>
-      <w:proofErr w:type="spellStart"/>
-      <w:r>
-        <w:rPr>
-          <w:rFonts w:ascii="Google Sans" w:eastAsia="Times New Roman" w:hAnsi="Google Sans" w:cs="Google Sans"/>
+          <w:rFonts w:ascii="Abyssinica SIL" w:eastAsia="Times New Roman" w:hAnsi="Abyssinica SIL" w:cs="Abyssinica SIL"/>
+          <w:color w:val="000000"/>
+          <w:kern w:val="0"/>
+          <w:sz w:val="22"/>
+          <w:szCs w:val="22"/>
+          <w:lang w:eastAsia="ja-JP"/>
+          <w14:ligatures w14:val="none"/>
+        </w:rPr>
+        <w:t xml:space="preserve"> </w:t>
+      </w:r>
+      <w:proofErr w:type="spellStart"/>
+      <w:r>
+        <w:rPr>
+          <w:rFonts w:ascii="Abyssinica SIL" w:eastAsia="Times New Roman" w:hAnsi="Abyssinica SIL" w:cs="Abyssinica SIL"/>
           <w:color w:val="000000"/>
           <w:kern w:val="0"/>
           <w:sz w:val="22"/>
@@ -860,66 +859,44 @@
       <w:proofErr w:type="spellEnd"/>
       <w:r>
         <w:rPr>
-          <w:rFonts w:ascii="Google Sans" w:eastAsia="Times New Roman" w:hAnsi="Google Sans" w:cs="Google Sans"/>
-          <w:color w:val="000000"/>
-          <w:kern w:val="0"/>
-          <w:sz w:val="22"/>
-          <w:szCs w:val="22"/>
-          <w:lang w:eastAsia="ja-JP"/>
-          <w14:ligatures w14:val="none"/>
-        </w:rPr>
-        <w:t xml:space="preserve"> </w:t>
-      </w:r>
-      <w:r>
-        <w:rPr>
-          <w:rFonts w:ascii="Google Sans" w:eastAsia="Times New Roman" w:hAnsi="Google Sans" w:cs="Google Sans"/>
-          <w:color w:val="000000"/>
-          <w:kern w:val="0"/>
-          <w:sz w:val="22"/>
-          <w:szCs w:val="22"/>
-          <w:lang w:eastAsia="ja-JP"/>
-          <w14:ligatures w14:val="none"/>
-        </w:rPr>
-        <w:t xml:space="preserve"> </w:t>
-      </w:r>
-      <w:r>
-        <w:rPr>
-          <w:rFonts w:ascii="Google Sans" w:hAnsi="Google Sans" w:cs="Google Sans"/>
-          <w:sz w:val="22"/>
-          <w:szCs w:val="22"/>
-        </w:rPr>
-        <w:t>ⶇⶮ</w:t>
-      </w:r>
-      <w:r>
-        <w:rPr>
-          <w:rFonts w:ascii="Google Sans" w:hAnsi="Google Sans" w:cs="Google Sans"/>
-          <w:sz w:val="22"/>
-          <w:szCs w:val="22"/>
-        </w:rPr>
-        <w:t xml:space="preserve"> </w:t>
-      </w:r>
-      <w:r>
-        <w:rPr>
-          <w:rFonts w:ascii="Google Sans" w:hAnsi="Google Sans" w:cs="Google Sans"/>
+          <w:rFonts w:ascii="Abyssinica SIL" w:eastAsia="Times New Roman" w:hAnsi="Abyssinica SIL" w:cs="Abyssinica SIL"/>
+          <w:color w:val="000000"/>
+          <w:kern w:val="0"/>
+          <w:sz w:val="22"/>
+          <w:szCs w:val="22"/>
+          <w:lang w:eastAsia="ja-JP"/>
+          <w14:ligatures w14:val="none"/>
+        </w:rPr>
+        <w:t xml:space="preserve">  </w:t>
+      </w:r>
+      <w:r>
+        <w:rPr>
+          <w:rFonts w:ascii="Abyssinica SIL" w:hAnsi="Abyssinica SIL" w:cs="Abyssinica SIL"/>
+          <w:sz w:val="22"/>
+          <w:szCs w:val="22"/>
+        </w:rPr>
+        <w:t xml:space="preserve">ⶇⶮ </w:t>
+      </w:r>
+      <w:r>
+        <w:rPr>
+          <w:rFonts w:ascii="Abyssinica SIL" w:hAnsi="Abyssinica SIL" w:cs="Abyssinica SIL"/>
           <w:w w:val="87"/>
           <w:sz w:val="22"/>
           <w:szCs w:val="22"/>
-          <w:highlight w:val="yellow"/>
         </w:rPr>
         <w:t>ⶐ</w:t>
       </w:r>
       <w:r>
         <w:rPr>
-          <w:rFonts w:ascii="Google Sans" w:hAnsi="Google Sans" w:cs="Google Sans"/>
-          <w:sz w:val="22"/>
-          <w:szCs w:val="22"/>
-          <w:highlight w:val="yellow"/>
+          <w:rFonts w:ascii="Abyssinica SIL" w:hAnsi="Abyssinica SIL" w:cs="Abyssinica SIL"/>
+          <w:sz w:val="22"/>
+          <w:szCs w:val="22"/>
         </w:rPr>
         <w:t>ⶾ</w:t>
       </w:r>
       <w:r>
         <w:rPr>
-          <w:rFonts w:ascii="Abyssinica SIL" w:hAnsi="Abyssinica SIL"/>
+          <w:rFonts w:ascii="Abyssinica SIL" w:hAnsi="Abyssinica SIL" w:cs="Abyssinica SIL"/>
           <w:w w:val="87"/>
           <w:sz w:val="22"/>
           <w:szCs w:val="22"/>
@@ -928,7 +905,7 @@
       </w:r>
       <w:r>
         <w:rPr>
-          <w:rFonts w:ascii="Google Sans" w:eastAsia="Times New Roman" w:hAnsi="Google Sans" w:cs="Google Sans"/>
+          <w:rFonts w:ascii="Abyssinica SIL" w:eastAsia="Times New Roman" w:hAnsi="Abyssinica SIL" w:cs="Abyssinica SIL"/>
           <w:color w:val="000000"/>
           <w:kern w:val="0"/>
           <w:sz w:val="22"/>
@@ -940,7 +917,7 @@
       </w:r>
       <w:r>
         <w:rPr>
-          <w:rFonts w:ascii="Google Sans" w:eastAsia="Times New Roman" w:hAnsi="Google Sans" w:cs="Google Sans"/>
+          <w:rFonts w:ascii="Abyssinica SIL" w:eastAsia="Times New Roman" w:hAnsi="Abyssinica SIL" w:cs="Abyssinica SIL"/>
           <w:color w:val="000000"/>
           <w:kern w:val="0"/>
           <w:sz w:val="22"/>
@@ -952,27 +929,15 @@
       </w:r>
       <w:r>
         <w:rPr>
-          <w:rFonts w:ascii="Google Sans" w:eastAsia="Times New Roman" w:hAnsi="Google Sans" w:cs="Google Sans"/>
-          <w:color w:val="000000"/>
-          <w:kern w:val="0"/>
-          <w:sz w:val="22"/>
-          <w:szCs w:val="22"/>
-          <w:lang w:eastAsia="ja-JP"/>
-          <w14:ligatures w14:val="none"/>
-        </w:rPr>
-        <w:t>፷</w:t>
-      </w:r>
-      <w:r>
-        <w:rPr>
-          <w:rFonts w:ascii="Google Sans" w:eastAsia="Times New Roman" w:hAnsi="Google Sans" w:cs="Google Sans"/>
-          <w:color w:val="000000"/>
-          <w:kern w:val="0"/>
-          <w:sz w:val="22"/>
-          <w:szCs w:val="22"/>
-          <w:lang w:eastAsia="ja-JP"/>
-          <w14:ligatures w14:val="none"/>
-        </w:rPr>
-        <w:t xml:space="preserve">  </w:t>
+          <w:rFonts w:ascii="Abyssinica SIL" w:eastAsia="Times New Roman" w:hAnsi="Abyssinica SIL" w:cs="Abyssinica SIL"/>
+          <w:color w:val="000000"/>
+          <w:kern w:val="0"/>
+          <w:sz w:val="22"/>
+          <w:szCs w:val="22"/>
+          <w:lang w:eastAsia="ja-JP"/>
+          <w14:ligatures w14:val="none"/>
+        </w:rPr>
+        <w:t xml:space="preserve">፷  </w:t>
       </w:r>
     </w:p>
     <w:p/>
@@ -1581,6 +1546,7 @@
   <w:style w:type="character" w:default="1" w:styleId="DefaultParagraphFont">
     <w:name w:val="Default Paragraph Font"/>
     <w:uiPriority w:val="1"/>
+    <w:semiHidden/>
     <w:unhideWhenUsed/>
   </w:style>
   <w:style w:type="table" w:default="1" w:styleId="TableNormal">

</xml_diff>